<commit_message>
contracts: v4 — strip pandoc bookmark anchors
Pandoc adds <w:bookmarkStart>/<w:bookmarkEnd> around every heading
for internal-link anchoring. Word ignores them, but Google Docs (new
UI) renders them as blue flag icons inline with the heading text,
which is visually distracting. Since the document has no internal
hyperlinks targeting these bookmarks, they are pure noise.

build_docx.py post-processing now removes all bookmark anchors from
the document body (142 removed = 71 headings × 2 elements per pair).

DOCX and PDF rebuilt. No content changes.
</commit_message>
<xml_diff>
--- a/contracts/ethnomir-app/Договор_ethnomir_app_v4.docx
+++ b/contracts/ethnomir-app/Договор_ethnomir_app_v4.docx
@@ -2,7 +2,6 @@
 <file path=word/document.xml><?xml version="1.0" encoding="utf-8"?>
 <w:document xmlns:w="http://schemas.openxmlformats.org/wordprocessingml/2006/main" xmlns:m="http://schemas.openxmlformats.org/officeDocument/2006/math" xmlns:r="http://schemas.openxmlformats.org/officeDocument/2006/relationships" xmlns:o="urn:schemas-microsoft-com:office:office" xmlns:v="urn:schemas-microsoft-com:vml" xmlns:w10="urn:schemas-microsoft-com:office:word" xmlns:a="http://schemas.openxmlformats.org/drawingml/2006/main" xmlns:pic="http://schemas.openxmlformats.org/drawingml/2006/picture" xmlns:wp="http://schemas.openxmlformats.org/drawingml/2006/wordprocessingDrawing">
   <w:body>
-    <w:bookmarkStart w:id="48" w:name="договор-04-052026"/>
     <w:p>
       <w:pPr>
         <w:pStyle w:val="Heading1"/>
@@ -15,7 +14,6 @@
         <w:t xml:space="preserve">ДОГОВОР № 04-05/2026</w:t>
       </w:r>
     </w:p>
-    <w:bookmarkStart w:id="20" w:name="X9d94cecbf2e720ece3ab72233ce11051dfd7be3"/>
     <w:p>
       <w:pPr>
         <w:pStyle w:val="Heading2"/>
@@ -310,8 +308,6 @@
         <w:t xml:space="preserve">) о нижеследующем.</w:t>
       </w:r>
     </w:p>
-    <w:bookmarkEnd w:id="20"/>
-    <w:bookmarkStart w:id="21" w:name="термины-и-определения"/>
     <w:p>
       <w:pPr>
         <w:pStyle w:val="Heading2"/>
@@ -723,8 +719,6 @@
         <w:t xml:space="preserve">— изменение или расширение функционала, выходящее за пределы ТЗ. Не является дефектом и устраняется (или нет) по дополнительному соглашению.</w:t>
       </w:r>
     </w:p>
-    <w:bookmarkEnd w:id="21"/>
-    <w:bookmarkStart w:id="22" w:name="предмет-договора"/>
     <w:p>
       <w:pPr>
         <w:pStyle w:val="Heading2"/>
@@ -1095,8 +1089,6 @@
         <w:t xml:space="preserve">Работы выполняются с использованием специалистов и инфраструктуры, привлечённых Исполнителем самостоятельно. Исполнитель несёт ответственность за действия привлечённых им третьих лиц как за свои собственные.</w:t>
       </w:r>
     </w:p>
-    <w:bookmarkEnd w:id="22"/>
-    <w:bookmarkStart w:id="23" w:name="стоимость-работ-и-порядок-оплаты"/>
     <w:p>
       <w:pPr>
         <w:pStyle w:val="Heading2"/>
@@ -1947,8 +1939,6 @@
         <w:t xml:space="preserve">Цена Договора не индексируется в течение срока выполнения Работ.</w:t>
       </w:r>
     </w:p>
-    <w:bookmarkEnd w:id="23"/>
-    <w:bookmarkStart w:id="28" w:name="сроки-выполнения-работ.-этапы"/>
     <w:p>
       <w:pPr>
         <w:pStyle w:val="Heading2"/>
@@ -2070,7 +2060,6 @@
         <w:t xml:space="preserve">. Подробный календарный план — Приложение № 2.</w:t>
       </w:r>
     </w:p>
-    <w:bookmarkStart w:id="24" w:name="этап-1.-развитие-и-новые-функции"/>
     <w:p>
       <w:pPr>
         <w:pStyle w:val="Heading3"/>
@@ -2163,8 +2152,6 @@
         <w:t xml:space="preserve">Отдельный Акт по Этапу 1 не составляется; выполнение Этапа 1 фиксируется фактом подписания Акта по Этапу 2.</w:t>
       </w:r>
     </w:p>
-    <w:bookmarkEnd w:id="24"/>
-    <w:bookmarkStart w:id="25" w:name="этап-2.-внедрение-в-этномире"/>
     <w:p>
       <w:pPr>
         <w:pStyle w:val="Heading3"/>
@@ -2257,8 +2244,6 @@
         <w:t xml:space="preserve">Закрытие этапа: подписание Сторонами Акта сдачи-приёмки по Этапу 2.</w:t>
       </w:r>
     </w:p>
-    <w:bookmarkEnd w:id="25"/>
-    <w:bookmarkStart w:id="26" w:name="этап-3.-пилотная-версия-запуск"/>
     <w:p>
       <w:pPr>
         <w:pStyle w:val="Heading3"/>
@@ -2351,8 +2336,6 @@
         <w:t xml:space="preserve">Закрытие этапа: подписание Сторонами Акта сдачи-приёмки по Этапу 3.</w:t>
       </w:r>
     </w:p>
-    <w:bookmarkEnd w:id="26"/>
-    <w:bookmarkStart w:id="27" w:name="этап-4.-бесплатное-сопровождение"/>
     <w:p>
       <w:pPr>
         <w:pStyle w:val="Heading3"/>
@@ -2501,9 +2484,6 @@
         <w:t xml:space="preserve">Срок начала Этапа 1 — день, следующий за днём поступления первого платежа (аванса) по п. 3.4 на расчётный счёт Исполнителя. До поступления аванса Исполнитель вправе не приступать к Работам без последствий по срокам.</w:t>
       </w:r>
     </w:p>
-    <w:bookmarkEnd w:id="27"/>
-    <w:bookmarkEnd w:id="28"/>
-    <w:bookmarkStart w:id="29" w:name="порядок-сдачи-приёмки-работ"/>
     <w:p>
       <w:pPr>
         <w:pStyle w:val="Heading2"/>
@@ -2684,8 +2664,6 @@
         <w:t xml:space="preserve">Допускается подписание Актов через системы электронного документооборота (ЭДО) с использованием квалифицированной электронной подписи, а также путём обмена сканированными копиями по e-mail с последующей передачей оригиналов; скан-копии имеют юридическую силу до обмена оригиналами.</w:t>
       </w:r>
     </w:p>
-    <w:bookmarkEnd w:id="29"/>
-    <w:bookmarkStart w:id="34" w:name="права-и-обязанности-сторон"/>
     <w:p>
       <w:pPr>
         <w:pStyle w:val="Heading2"/>
@@ -2698,7 +2676,6 @@
         <w:t xml:space="preserve">6. ПРАВА И ОБЯЗАННОСТИ СТОРОН</w:t>
       </w:r>
     </w:p>
-    <w:bookmarkStart w:id="30" w:name="обязанности-исполнителя"/>
     <w:p>
       <w:pPr>
         <w:pStyle w:val="Heading3"/>
@@ -2947,8 +2924,6 @@
         <w:t xml:space="preserve">после передачи РИД Заказчику — сохранить у себя бэкапы исходных материалов в течение 12 месяцев для возможности оперативной поддержки.</w:t>
       </w:r>
     </w:p>
-    <w:bookmarkEnd w:id="30"/>
-    <w:bookmarkStart w:id="31" w:name="обязанности-заказчика"/>
     <w:p>
       <w:pPr>
         <w:pStyle w:val="Heading3"/>
@@ -3265,8 +3240,6 @@
         <w:t xml:space="preserve">соблюдать режим конфиденциальности (раздел 11).</w:t>
       </w:r>
     </w:p>
-    <w:bookmarkEnd w:id="31"/>
-    <w:bookmarkStart w:id="32" w:name="права-исполнителя"/>
     <w:p>
       <w:pPr>
         <w:pStyle w:val="Heading3"/>
@@ -3403,8 +3376,6 @@
         <w:t xml:space="preserve">использовать разработанные в рамках Договора архитектурные решения, общие подходы к дизайну, методологические разработки и нестандартные технические решения в своих других проектах, при условии, что такое использование не воспроизводит фирменный стиль «Этномир» и не копирует уникальный контент проекта.</w:t>
       </w:r>
     </w:p>
-    <w:bookmarkEnd w:id="32"/>
-    <w:bookmarkStart w:id="33" w:name="права-заказчика"/>
     <w:p>
       <w:pPr>
         <w:pStyle w:val="Heading3"/>
@@ -3513,9 +3484,6 @@
         <w:t xml:space="preserve">после полной оплаты и подписания Актов по всем Этапам — использовать результат Работ по своему усмотрению, включая воспроизведение, распространение, модификацию, сублицензирование и передачу третьим лицам (в пределах прав, переданных по разделу 9).</w:t>
       </w:r>
     </w:p>
-    <w:bookmarkEnd w:id="33"/>
-    <w:bookmarkEnd w:id="34"/>
-    <w:bookmarkStart w:id="35" w:name="X285e9c36a2eeb09063a8dbc0399033d6d16c4c3"/>
     <w:p>
       <w:pPr>
         <w:pStyle w:val="Heading2"/>
@@ -3839,8 +3807,6 @@
         <w:t xml:space="preserve">изменением законодательства РФ (аналогично).</w:t>
       </w:r>
     </w:p>
-    <w:bookmarkEnd w:id="35"/>
-    <w:bookmarkStart w:id="36" w:name="гарантийные-обязательства"/>
     <w:p>
       <w:pPr>
         <w:pStyle w:val="Heading2"/>
@@ -4077,8 +4043,6 @@
         <w:t xml:space="preserve">падение производительности, вызванное ростом нагрузки сверх показателей, заложенных в ТЗ (масштабирование под многократный рост — отдельные Работы).</w:t>
       </w:r>
     </w:p>
-    <w:bookmarkEnd w:id="36"/>
-    <w:bookmarkStart w:id="37" w:name="исключительные-права-на-результаты-работ"/>
     <w:p>
       <w:pPr>
         <w:pStyle w:val="Heading2"/>
@@ -4493,8 +4457,6 @@
         <w:t xml:space="preserve">Исполнитель сохраняет неимущественное право авторства и право быть указанным в качестве автора / разработчика; для публичного маркетинга Исполнитель вправе использовать факт выполнения Работ для Заказчика в рамках п. 6.3.3 и 6.3.4.</w:t>
       </w:r>
     </w:p>
-    <w:bookmarkEnd w:id="37"/>
-    <w:bookmarkStart w:id="38" w:name="устранение-дефектов.-сроки-сопровождения"/>
     <w:p>
       <w:pPr>
         <w:pStyle w:val="Heading2"/>
@@ -4855,8 +4817,6 @@
         <w:t xml:space="preserve">По истечении гарантийного срока Стороны могут заключить отдельный договор на платное сопровождение ПО.</w:t>
       </w:r>
     </w:p>
-    <w:bookmarkEnd w:id="38"/>
-    <w:bookmarkStart w:id="39" w:name="конфиденциальность"/>
     <w:p>
       <w:pPr>
         <w:pStyle w:val="Heading2"/>
@@ -5167,8 +5127,6 @@
         <w:t xml:space="preserve">В целях соблюдения требований Федерального закона № 152-ФЗ «О персональных данных» при разработке ПО Исполнитель обрабатывает персональные данные гостей только в минимально необходимом объёме для тестирования и отладки, использует обезличенные или тестовые данные там, где это возможно, и удаляет со своих сторонних тестовых окружений персональные данные в течение 30 дней после завершения тестирования.</w:t>
       </w:r>
     </w:p>
-    <w:bookmarkEnd w:id="39"/>
-    <w:bookmarkStart w:id="40" w:name="ответственность-сторон"/>
     <w:p>
       <w:pPr>
         <w:pStyle w:val="Heading2"/>
@@ -5316,8 +5274,6 @@
         <w:t xml:space="preserve">Стороны не несут ответственности за косвенные убытки (репутационные потери, упущенную выгоду, ущерб третьих лиц), за исключением случаев умысла.</w:t>
       </w:r>
     </w:p>
-    <w:bookmarkEnd w:id="40"/>
-    <w:bookmarkStart w:id="41" w:name="форс-мажор"/>
     <w:p>
       <w:pPr>
         <w:pStyle w:val="Heading2"/>
@@ -5442,8 +5398,6 @@
         <w:t xml:space="preserve">Если форс-мажор длится более 3 (трёх) месяцев, любая из Сторон вправе расторгнуть Договор в одностороннем внесудебном порядке, письменно уведомив другую Сторону. В этом случае проводится финансовая сверка и расчёт исходя из объёма фактически выполненных Работ и произведённой оплаты.</w:t>
       </w:r>
     </w:p>
-    <w:bookmarkEnd w:id="41"/>
-    <w:bookmarkStart w:id="42" w:name="разрешение-споров"/>
     <w:p>
       <w:pPr>
         <w:pStyle w:val="Heading2"/>
@@ -5598,8 +5552,6 @@
         <w:t xml:space="preserve">При рассмотрении спора применяется материальное и процессуальное право Российской Федерации.</w:t>
       </w:r>
     </w:p>
-    <w:bookmarkEnd w:id="42"/>
-    <w:bookmarkStart w:id="43" w:name="срок-действия-и-расторжение-договора"/>
     <w:p>
       <w:pPr>
         <w:pStyle w:val="Heading2"/>
@@ -5788,8 +5740,6 @@
         <w:t xml:space="preserve">При расторжении Договора до полной оплаты Этапа 3 права на уже созданные и принятые Заказчиком РИД сохраняются у Заказчика в объёме, предусмотренном подписанными Актами и произведёнными оплатами. Права на РИД, созданные, но не принятые Заказчиком и не оплаченные, остаются у Исполнителя.</w:t>
       </w:r>
     </w:p>
-    <w:bookmarkEnd w:id="43"/>
-    <w:bookmarkStart w:id="44" w:name="прочие-условия"/>
     <w:p>
       <w:pPr>
         <w:pStyle w:val="Heading2"/>
@@ -6098,8 +6048,6 @@
         <w:t xml:space="preserve">В части, не урегулированной настоящим Договором, Стороны руководствуются законодательством Российской Федерации, в том числе главами 37 и 39 ГК РФ, статьями 1233, 1234, 1285, 1296 ГК РФ.</w:t>
       </w:r>
     </w:p>
-    <w:bookmarkEnd w:id="44"/>
-    <w:bookmarkStart w:id="47" w:name="реквизиты-и-подписи-сторон"/>
     <w:p>
       <w:pPr>
         <w:pStyle w:val="Heading2"/>
@@ -6112,7 +6060,6 @@
         <w:t xml:space="preserve">17. РЕКВИЗИТЫ И ПОДПИСИ СТОРОН</w:t>
       </w:r>
     </w:p>
-    <w:bookmarkStart w:id="45" w:name="исполнитель"/>
     <w:p>
       <w:pPr>
         <w:pStyle w:val="Heading3"/>
@@ -6273,8 +6220,6 @@
         <w:t xml:space="preserve">Подпись: ______________________ / Иванов Евгений Владимирович /</w:t>
       </w:r>
     </w:p>
-    <w:bookmarkEnd w:id="45"/>
-    <w:bookmarkStart w:id="46" w:name="заказчик"/>
     <w:p>
       <w:pPr>
         <w:pStyle w:val="Heading3"/>
@@ -6470,10 +6415,6 @@
         <w:br w:type="page"/>
       </w:r>
     </w:p>
-    <w:bookmarkEnd w:id="46"/>
-    <w:bookmarkEnd w:id="47"/>
-    <w:bookmarkEnd w:id="48"/>
-    <w:bookmarkStart w:id="49" w:name="приложение-1-к-договору-04-052026"/>
     <w:p>
       <w:pPr>
         <w:pStyle w:val="Heading1"/>
@@ -6486,8 +6427,6 @@
         <w:t xml:space="preserve">ПРИЛОЖЕНИЕ № 1 К ДОГОВОРУ № 04-05/2026</w:t>
       </w:r>
     </w:p>
-    <w:bookmarkEnd w:id="49"/>
-    <w:bookmarkStart w:id="80" w:name="техническое-задание"/>
     <w:p>
       <w:pPr>
         <w:pStyle w:val="Heading1"/>
@@ -6500,7 +6439,6 @@
         <w:t xml:space="preserve">ТЕХНИЧЕСКОЕ ЗАДАНИЕ</w:t>
       </w:r>
     </w:p>
-    <w:bookmarkStart w:id="50" w:name="X455b3e099177421f748545f2de62e88f99a5a7c"/>
     <w:p>
       <w:pPr>
         <w:pStyle w:val="Heading2"/>
@@ -6513,8 +6451,6 @@
         <w:t xml:space="preserve">на разработку суперприложения ethnomir.app, ре-упаковку сайта ethnomir.ru, ре-брендинг Этномира и продуктовую линейку</w:t>
       </w:r>
     </w:p>
-    <w:bookmarkEnd w:id="50"/>
-    <w:bookmarkStart w:id="51" w:name="назначение-и-структура-документа"/>
     <w:p>
       <w:pPr>
         <w:pStyle w:val="Heading2"/>
@@ -7004,8 +6940,6 @@
         <w:t xml:space="preserve">Рост целевого показателя в процессе разработки не является нарушением Исполнителем требований ТЗ при условии, что минимальный обязательный показатель выполнен.</w:t>
       </w:r>
     </w:p>
-    <w:bookmarkEnd w:id="51"/>
-    <w:bookmarkStart w:id="52" w:name="общие-требования-к-продукту"/>
     <w:p>
       <w:pPr>
         <w:pStyle w:val="Heading2"/>
@@ -7822,8 +7756,6 @@
         <w:t xml:space="preserve">Требования к доступности интерфейсов реализуются в рамках общепринятых современных практик проектирования мобильных и веб-интерфейсов.</w:t>
       </w:r>
     </w:p>
-    <w:bookmarkEnd w:id="52"/>
-    <w:bookmarkStart w:id="53" w:name="X29cfc12423ab78cef07232c7daf71fc6554a00b"/>
     <w:p>
       <w:pPr>
         <w:pStyle w:val="Heading2"/>
@@ -9205,8 +9137,6 @@
         </w:tc>
       </w:tr>
     </w:tbl>
-    <w:bookmarkEnd w:id="53"/>
-    <w:bookmarkStart w:id="68" w:name="X972df06d3b320166474c168e3e264c713b305a6"/>
     <w:p>
       <w:pPr>
         <w:pStyle w:val="Heading2"/>
@@ -9219,7 +9149,6 @@
         <w:t xml:space="preserve">3. Клиентский контур — подробное описание модулей</w:t>
       </w:r>
     </w:p>
-    <w:bookmarkStart w:id="54" w:name="модуль-м00.-главная-сегодня"/>
     <w:p>
       <w:pPr>
         <w:pStyle w:val="Heading3"/>
@@ -9352,8 +9281,6 @@
         <w:t xml:space="preserve">нижний Tab Bar в стиле iOS 26+ Liquid Glass.</w:t>
       </w:r>
     </w:p>
-    <w:bookmarkEnd w:id="54"/>
-    <w:bookmarkStart w:id="55" w:name="модуль-м01.-парк-и-билеты"/>
     <w:p>
       <w:pPr>
         <w:pStyle w:val="Heading3"/>
@@ -9710,8 +9637,6 @@
         <w:t xml:space="preserve">публичная ссылка на чек без авторизации (п. 3.6).</w:t>
       </w:r>
     </w:p>
-    <w:bookmarkEnd w:id="55"/>
-    <w:bookmarkStart w:id="56" w:name="модуль-м02.-жильё"/>
     <w:p>
       <w:pPr>
         <w:pStyle w:val="Heading3"/>
@@ -10110,8 +10035,6 @@
         <w:t xml:space="preserve">заявка на просмотр одним тапом — передаётся в CRM «Лиды» с пометкой «Инвестиционная недвижимость».</w:t>
       </w:r>
     </w:p>
-    <w:bookmarkEnd w:id="56"/>
-    <w:bookmarkStart w:id="57" w:name="модуль-м03.-услуги"/>
     <w:p>
       <w:pPr>
         <w:pStyle w:val="Heading3"/>
@@ -10340,8 +10263,6 @@
         <w:t xml:space="preserve">Правила начисления баллов по категориям: доставка +15, ресторан +25, СПА +35, мастер-класс +40.</w:t>
       </w:r>
     </w:p>
-    <w:bookmarkEnd w:id="57"/>
-    <w:bookmarkStart w:id="58" w:name="модуль-м04.-паспорт-путешественника"/>
     <w:p>
       <w:pPr>
         <w:pStyle w:val="Heading3"/>
@@ -11173,8 +11094,6 @@
         <w:t xml:space="preserve">Минимум 5 уровней: Гость → Турист → Знаток → Легенда → Посол Этномира. Правила перехода (пороги в баллах) настраиваются через CRM.</w:t>
       </w:r>
     </w:p>
-    <w:bookmarkEnd w:id="58"/>
-    <w:bookmarkStart w:id="59" w:name="модуль-м05.-чеки-и-qr-экосистема"/>
     <w:p>
       <w:pPr>
         <w:pStyle w:val="Heading3"/>
@@ -11491,8 +11410,6 @@
         <w:t xml:space="preserve">— через отдельную операцию, которая создаёт новый связанный чек со статусом «Возврат» и ссылкой на оригинал.</w:t>
       </w:r>
     </w:p>
-    <w:bookmarkEnd w:id="59"/>
-    <w:bookmarkStart w:id="60" w:name="модуль-м06.-этномир-хаб"/>
     <w:p>
       <w:pPr>
         <w:pStyle w:val="Heading3"/>
@@ -11934,8 +11851,6 @@
         <w:t xml:space="preserve">Правила использования промокодов.</w:t>
       </w:r>
     </w:p>
-    <w:bookmarkEnd w:id="60"/>
-    <w:bookmarkStart w:id="61" w:name="модуль-м07.-франшиза-этномира"/>
     <w:p>
       <w:pPr>
         <w:pStyle w:val="Heading3"/>
@@ -11960,8 +11875,6 @@
         <w:t xml:space="preserve">Отдельный лендинг-воронка B2B-продаж с формой заявки, интегрированной с модулем CRM «Лиды». Наполнение лендинга (тексты, цифры, медиаматериалы, состав блоков) согласовывается и предоставляется Заказчиком в рабочем порядке; Исполнитель обеспечивает техническую реализацию, форму заявки и сквозную интеграцию «заявка → CRM → уведомление ответственному».</w:t>
       </w:r>
     </w:p>
-    <w:bookmarkEnd w:id="61"/>
-    <w:bookmarkStart w:id="62" w:name="модуль-м08.-календарь-событий"/>
     <w:p>
       <w:pPr>
         <w:pStyle w:val="Heading3"/>
@@ -12095,8 +12008,6 @@
         <w:t xml:space="preserve">: блок-уведомление «Номера на праздничные даты заканчиваются за 2–3 недели. Забронируйте сейчас со скидкой!» с прямым переходом в «Жильё» (кросс-продажа).</w:t>
       </w:r>
     </w:p>
-    <w:bookmarkEnd w:id="62"/>
-    <w:bookmarkStart w:id="63" w:name="модуль-м09.-сертификаты"/>
     <w:p>
       <w:pPr>
         <w:pStyle w:val="Heading3"/>
@@ -12262,8 +12173,6 @@
         <w:t xml:space="preserve">отображается в Паспорте (раздел «Мои заявки»).</w:t>
       </w:r>
     </w:p>
-    <w:bookmarkEnd w:id="63"/>
-    <w:bookmarkStart w:id="64" w:name="модуль-м10.-b2b-направление"/>
     <w:p>
       <w:pPr>
         <w:pStyle w:val="Heading3"/>
@@ -12396,8 +12305,6 @@
         <w:t xml:space="preserve">Все заявки передаются в модуль CRM «Лиды» с пометкой категории.</w:t>
       </w:r>
     </w:p>
-    <w:bookmarkEnd w:id="64"/>
-    <w:bookmarkStart w:id="65" w:name="модуль-м11.-отзывы-и-nps"/>
     <w:p>
       <w:pPr>
         <w:pStyle w:val="Heading3"/>
@@ -12570,8 +12477,6 @@
         <w:t xml:space="preserve">— автоматическая фильтрация ненормативной лексики + ручная модерация в CRM.</w:t>
       </w:r>
     </w:p>
-    <w:bookmarkEnd w:id="65"/>
-    <w:bookmarkStart w:id="66" w:name="модуль-м12.-уведомления"/>
     <w:p>
       <w:pPr>
         <w:pStyle w:val="Heading3"/>
@@ -12764,8 +12669,6 @@
         <w:t xml:space="preserve">Инфраструктура в БД: отдельные таблицы для промо-акций, промо-баннеров, промо-кодов, использований промо-кодов, push-сообщений, push-подписок, push-токенов, уведомлений и ограничителей частоты SMS.</w:t>
       </w:r>
     </w:p>
-    <w:bookmarkEnd w:id="66"/>
-    <w:bookmarkStart w:id="67" w:name="модуль-м13.-глобальный-поиск"/>
     <w:p>
       <w:pPr>
         <w:pStyle w:val="Heading3"/>
@@ -12931,9 +12834,6 @@
         <w:t xml:space="preserve">— сгруппированы по категориям (Отели, Рестораны, Активности, Статьи и т. д.) с иконками, кратким описанием, переходом в карточку одним тапом.</w:t>
       </w:r>
     </w:p>
-    <w:bookmarkEnd w:id="67"/>
-    <w:bookmarkEnd w:id="68"/>
-    <w:bookmarkStart w:id="69" w:name="Xd45a49e1f355dac01804dc90d900ebf7b8ecda3"/>
     <w:p>
       <w:pPr>
         <w:pStyle w:val="Heading2"/>
@@ -15536,8 +15436,6 @@
         <w:t xml:space="preserve">(по образцу справочника) с отдельными наборами прав.</w:t>
       </w:r>
     </w:p>
-    <w:bookmarkEnd w:id="69"/>
-    <w:bookmarkStart w:id="70" w:name="Xcd410e39aaf2f89e272d56b13eebe2b5deba58b"/>
     <w:p>
       <w:pPr>
         <w:pStyle w:val="Heading2"/>
@@ -15770,8 +15668,6 @@
         <w:t xml:space="preserve">Все движения баллов записываются в таблицу транзакций с указанием: пользователь, тип операции (начисление / списание), сумма, источник, дата/время. История доступна пользователю в разделе «Кошелёк» Паспорта.</w:t>
       </w:r>
     </w:p>
-    <w:bookmarkEnd w:id="70"/>
-    <w:bookmarkStart w:id="71" w:name="Xf18e2fec73d265939cbd83068e995f0203ab408"/>
     <w:p>
       <w:pPr>
         <w:pStyle w:val="Heading2"/>
@@ -16646,8 +16542,6 @@
         <w:t xml:space="preserve">— декоративный слой анимированных орбов на промо-баннерах: sheen-sweep, twinkle, ripple, drift particles.</w:t>
       </w:r>
     </w:p>
-    <w:bookmarkEnd w:id="71"/>
-    <w:bookmarkStart w:id="72" w:name="X036294858f3172469d42030da7b6b1c590d4a6c"/>
     <w:p>
       <w:pPr>
         <w:pStyle w:val="Heading2"/>
@@ -17040,8 +16934,6 @@
         <w:t xml:space="preserve">Непрерывная интеграция и развёртывание с автоматической сборкой, предварительным развёртыванием (preview) перед публикацией, атомарным переключением на production без простоев и возможностью быстрого отката к предыдущей версии. Мониторинг состояния системы — в виде приборной панели с целевым показателем стабильности.</w:t>
       </w:r>
     </w:p>
-    <w:bookmarkEnd w:id="72"/>
-    <w:bookmarkStart w:id="73" w:name="блок-1.-мега-приложение.-база-данных"/>
     <w:p>
       <w:pPr>
         <w:pStyle w:val="Heading2"/>
@@ -18147,8 +18039,6 @@
         <w:t xml:space="preserve">Перечень и конкретный состав таблиц — ориентировочные и могут уточняться по ходу Работ.</w:t>
       </w:r>
     </w:p>
-    <w:bookmarkEnd w:id="73"/>
-    <w:bookmarkStart w:id="74" w:name="X5263c6d0259627cd367d8e4e93a5edf70c77207"/>
     <w:p>
       <w:pPr>
         <w:pStyle w:val="Heading2"/>
@@ -19122,8 +19012,6 @@
         <w:t xml:space="preserve">Содержание каждого документа предоставляется Заказчиком (или согласуется с юристом Заказчика) до Этапа 3; Исполнитель готовит правильные шаблоны и интегрирует их в приложение.</w:t>
       </w:r>
     </w:p>
-    <w:bookmarkEnd w:id="74"/>
-    <w:bookmarkStart w:id="75" w:name="X1073cf25b1a0192f2a9f0f5e277d41e09cb5267"/>
     <w:p>
       <w:pPr>
         <w:pStyle w:val="Heading2"/>
@@ -19534,8 +19422,6 @@
         <w:t xml:space="preserve">поддержка ru/en (если успевают к запуску — иначе только ru).</w:t>
       </w:r>
     </w:p>
-    <w:bookmarkEnd w:id="75"/>
-    <w:bookmarkStart w:id="76" w:name="блок-2.-ре-упаковка-сайта-ethnomir.ru"/>
     <w:p>
       <w:pPr>
         <w:pStyle w:val="Heading2"/>
@@ -19824,8 +19710,6 @@
         <w:t xml:space="preserve">с представлением мобильного приложения и CTA на установку из App Store и Google Play. Наполнение — согласовывается и предоставляется Заказчиком в рабочем порядке.</w:t>
       </w:r>
     </w:p>
-    <w:bookmarkEnd w:id="76"/>
-    <w:bookmarkStart w:id="77" w:name="блок-3.-ре-брендинг-этномира"/>
     <w:p>
       <w:pPr>
         <w:pStyle w:val="Heading2"/>
@@ -20100,8 +19984,6 @@
         <w:t xml:space="preserve">Все элементы предоставляются в редактируемых форматах (SVG, AI, PSD, PPTX) и в готовых PNG / PDF высокого разрешения.</w:t>
       </w:r>
     </w:p>
-    <w:bookmarkEnd w:id="77"/>
-    <w:bookmarkStart w:id="78" w:name="блок-4.-продуктовая-линейка"/>
     <w:p>
       <w:pPr>
         <w:pStyle w:val="Heading2"/>
@@ -20380,8 +20262,6 @@
         <w:t xml:space="preserve">— принципы установления тарифов (будни / выходные / праздники / сезоны), скидок, бонусов, бандл-предложений.</w:t>
       </w:r>
     </w:p>
-    <w:bookmarkEnd w:id="78"/>
-    <w:bookmarkStart w:id="79" w:name="критерии-приёмки"/>
     <w:p>
       <w:pPr>
         <w:pStyle w:val="Heading2"/>
@@ -20677,9 +20557,6 @@
         <w:br w:type="page"/>
       </w:r>
     </w:p>
-    <w:bookmarkEnd w:id="79"/>
-    <w:bookmarkEnd w:id="80"/>
-    <w:bookmarkStart w:id="81" w:name="приложение-2-к-договору-04-052026"/>
     <w:p>
       <w:pPr>
         <w:pStyle w:val="Heading1"/>
@@ -20692,8 +20569,6 @@
         <w:t xml:space="preserve">ПРИЛОЖЕНИЕ № 2 К ДОГОВОРУ № 04-05/2026</w:t>
       </w:r>
     </w:p>
-    <w:bookmarkEnd w:id="81"/>
-    <w:bookmarkStart w:id="85" w:name="календарный-план-работ"/>
     <w:p>
       <w:pPr>
         <w:pStyle w:val="Heading1"/>
@@ -20706,7 +20581,6 @@
         <w:t xml:space="preserve">КАЛЕНДАРНЫЙ ПЛАН РАБОТ</w:t>
       </w:r>
     </w:p>
-    <w:bookmarkStart w:id="82" w:name="общая-схема"/>
     <w:p>
       <w:pPr>
         <w:pStyle w:val="Heading2"/>
@@ -21236,8 +21110,6 @@
         </w:tc>
       </w:tr>
     </w:tbl>
-    <w:bookmarkEnd w:id="82"/>
-    <w:bookmarkStart w:id="83" w:name="ключевые-вехи-milestones"/>
     <w:p>
       <w:pPr>
         <w:pStyle w:val="Heading2"/>
@@ -21804,8 +21676,6 @@
         </w:tc>
       </w:tr>
     </w:tbl>
-    <w:bookmarkEnd w:id="83"/>
-    <w:bookmarkStart w:id="84" w:name="регулярные-мероприятия"/>
     <w:p>
       <w:pPr>
         <w:pStyle w:val="Heading2"/>
@@ -22116,9 +21986,6 @@
         <w:br w:type="page"/>
       </w:r>
     </w:p>
-    <w:bookmarkEnd w:id="84"/>
-    <w:bookmarkEnd w:id="85"/>
-    <w:bookmarkStart w:id="86" w:name="приложение-3-к-договору-04-052026"/>
     <w:p>
       <w:pPr>
         <w:pStyle w:val="Heading1"/>
@@ -22131,8 +21998,6 @@
         <w:t xml:space="preserve">ПРИЛОЖЕНИЕ № 3 К ДОГОВОРУ № 04-05/2026</w:t>
       </w:r>
     </w:p>
-    <w:bookmarkEnd w:id="86"/>
-    <w:bookmarkStart w:id="90" w:name="X8b5bc1fefe7d8370817f1d731bdc28abc391c3d"/>
     <w:p>
       <w:pPr>
         <w:pStyle w:val="Heading1"/>
@@ -22145,7 +22010,6 @@
         <w:t xml:space="preserve">ФОРМА АКТА СДАЧИ-ПРИЁМКИ ВЫПОЛНЕННЫХ РАБОТ</w:t>
       </w:r>
     </w:p>
-    <w:bookmarkStart w:id="87" w:name="акт"/>
     <w:p>
       <w:pPr>
         <w:pStyle w:val="Heading2"/>
@@ -22158,8 +22022,6 @@
         <w:t xml:space="preserve">АКТ</w:t>
       </w:r>
     </w:p>
-    <w:bookmarkEnd w:id="87"/>
-    <w:bookmarkStart w:id="89" w:name="Xf02c51d72780fd4adb7f6344e98a13d44407440"/>
     <w:p>
       <w:pPr>
         <w:pStyle w:val="Heading2"/>
@@ -22577,7 +22439,6 @@
         <w:t xml:space="preserve">Настоящий Акт составлен в 2 (двух) экземплярах, по одному для каждой из Сторон.</w:t>
       </w:r>
     </w:p>
-    <w:bookmarkStart w:id="88" w:name="подписи-сторон"/>
     <w:p>
       <w:pPr>
         <w:pStyle w:val="Heading3"/>
@@ -22684,9 +22545,6 @@
         <w:t xml:space="preserve">Конец документа.</w:t>
       </w:r>
     </w:p>
-    <w:bookmarkEnd w:id="88"/>
-    <w:bookmarkEnd w:id="89"/>
-    <w:bookmarkEnd w:id="90"/>
     <w:sectPr>
       <w:pgSz w:h="15840" w:w="12240"/>
       <w:pgMar w:bottom="1134" w:footer="720" w:gutter="0" w:header="720" w:left="1417" w:right="850" w:top="1134"/>

</xml_diff>